<commit_message>
refactor(boveda): unify into single institutional email login and institutional signature (Equipo UNIVERSO693 SpA)
</commit_message>
<xml_diff>
--- a/Carta_Requerimientos_Inicio_Proyecto_Igneo.docx
+++ b/Carta_Requerimientos_Inicio_Proyecto_Igneo.docx
@@ -150,7 +150,7 @@
           <w:color w:val="334155"/>
           <w:sz w:val="18"/>
         </w:rPr>
-        <w:t>Requerimientos Técnicos, Administrativos y Habilitación de Bóveda Segura con Clave de Acceso</w:t>
+        <w:t>Habilitación de Bóveda Digital con Correo Institucional y Recepción de Insumos</w:t>
       </w:r>
     </w:p>
     <w:p>
@@ -164,7 +164,7 @@
           <w:color w:val="334155"/>
           <w:sz w:val="18"/>
         </w:rPr>
-        <w:t>Junto con saludar cordialmente y con el objeto de asegurar un inicio de proyecto ágil, estructurado y sin fricciones operativas, ponemos a su disposición la presente Guía de Requerimientos Iniciales (Kickoff). Para garantizar máxima ciberseguridad y centralización sin saturar al equipo con múltiples sistemas, hemos unificado todo el proceso dentro de la Bóveda Digital de UNIVERSO693 (https://universo693.com/boveda), en el módulo "Configuración &amp; Recepción de Insumos", protegido mediante clave institucional exclusiva.</w:t>
+        <w:t>Junto con saludar cordialmente y con el objeto de asegurar un inicio de proyecto ágil, estructurado y sin fricciones operativas, ponemos a su disposición la presente Guía de Requerimientos Iniciales (Kickoff). Para garantizar máxima ciberseguridad, orden y centralización sin saturar al equipo con múltiples sistemas, desde el día uno hemos unificado todo el proceso en la Bóveda Digital de UNIVERSO693 (https://universo693.com/boveda) mediante un único acceso con correo institucional y contraseña maestra asignada.</w:t>
       </w:r>
     </w:p>
     <w:tbl>
@@ -199,7 +199,7 @@
                 <w:color w:val="15803D"/>
                 <w:sz w:val="17"/>
               </w:rPr>
-              <w:t xml:space="preserve">🔒 ACCESO CENTRALIZADO A BÓVEDA DIGITAL: </w:t>
+              <w:t xml:space="preserve">🔒 ACCESO INSTITUCIONAL A BÓVEDA DIGITAL: </w:t>
             </w:r>
             <w:r>
               <w:rPr>
@@ -216,31 +216,31 @@
                 <w:color w:val="0F172A"/>
                 <w:sz w:val="17"/>
               </w:rPr>
-              <w:t xml:space="preserve">📂 MÓDULO DIRECTO: </w:t>
+              <w:t xml:space="preserve">📧 CORREO INSTITUCIONAL HABILITADO: </w:t>
             </w:r>
             <w:r>
               <w:rPr>
                 <w:color w:val="0284C7"/>
                 <w:sz w:val="17"/>
               </w:rPr>
-              <w:t>Configuración &amp; Recepción de Insumos (Fase 1)</w:t>
+              <w:t>contacto@bomberosvinadelmar.cl (o el correo oficial que la Fundación designe)</w:t>
               <w:br/>
             </w:r>
             <w:r>
               <w:rPr>
                 <w:b/>
                 <w:color w:val="0284C7"/>
-                <w:sz w:val="18"/>
+                <w:sz w:val="17"/>
               </w:rPr>
-              <w:t xml:space="preserve">🔑 CLAVE INSTITUCIONAL DE ACCESO: </w:t>
+              <w:t xml:space="preserve">🔑 CONTRASEÑA MAESTRA ASIGNADA: </w:t>
             </w:r>
             <w:r>
               <w:rPr>
                 <w:b/>
                 <w:color w:val="0F172A"/>
-                <w:sz w:val="19"/>
+                <w:sz w:val="18"/>
               </w:rPr>
-              <w:t>IGNEO-2026</w:t>
+              <w:t>Bomberos2026!</w:t>
               <w:br/>
             </w:r>
             <w:r>
@@ -248,7 +248,7 @@
                 <w:color w:val="334155"/>
                 <w:sz w:val="16"/>
               </w:rPr>
-              <w:t>Acceso restringido y cifrado bajo estándar AES-256 en un único portal corporativo. Al ingresar la clave, el equipo de Ígneo puede gestionar la entrega de insumos a su ritmo y consultar en el mismo espacio la Bóveda de Credenciales y Soberanía Tecnológica.</w:t>
+              <w:t>Al ingresar con estas credenciales, accederán en un solo lugar al módulo 'Configuración &amp; Recepción de Insumos' para cargar los materiales solicitados a continuación, y mantendrán permanentemente disponible su Bóveda de Credenciales y Soberanía Tecnológica.</w:t>
             </w:r>
           </w:p>
         </w:tc>
@@ -530,7 +530,7 @@
           <w:color w:val="334155"/>
           <w:sz w:val="17"/>
         </w:rPr>
-        <w:t>Designar a UNIVERSO693 SpA (Alexis Santana Miranda, alex@universo693.com) para autorizarnos a recibir las llaves técnicas de prueba y certificar el paso a producción.</w:t>
+        <w:t>Designar a UNIVERSO693 SpA (Equipo de Ingeniería &amp; Arquitectura de Software, contacto@universo693.com) para autorizarnos a recibir las llaves técnicas de prueba y certificar el paso a producción.</w:t>
       </w:r>
     </w:p>
     <w:p>
@@ -777,7 +777,7 @@
           <w:color w:val="0F172A"/>
           <w:sz w:val="19"/>
         </w:rPr>
-        <w:t>ALEXIS PATRICIO SANTANA MIRANDA</w:t>
+        <w:t>EQUIPO DE INGENIERÍA &amp; DESPLIEGUE CLOUD</w:t>
         <w:br/>
       </w:r>
       <w:r>
@@ -785,9 +785,9 @@
           <w:color w:val="64748B"/>
           <w:sz w:val="16"/>
         </w:rPr>
-        <w:t>Fundador &amp; Director de Tecnología</w:t>
+        <w:t>UNIVERSO693 SpA</w:t>
         <w:br/>
-        <w:t>UNIVERSO693 SpA</w:t>
+        <w:t>Área de Arquitectura de Software &amp; Soluciones E-Learning</w:t>
         <w:br/>
         <w:t>contacto@universo693.com • +56 9 9038 7414 • universo693.com</w:t>
         <w:br/>

</xml_diff>